<commit_message>
+Incomplete search flowchart (also outdated) and documentation. Fully functionized search.route (before it had an if loop in the main branch of logic.
</commit_message>
<xml_diff>
--- a/docs/nea_student_raport.docx
+++ b/docs/nea_student_raport.docx
@@ -27,7 +27,23 @@
         <w:rPr>
           <w:rFonts w:ascii="Liberation Sans" w:hAnsi="Liberation Sans"/>
         </w:rPr>
-        <w:t>Participant – Gabriel Drozbik  (id=338676)</w:t>
+        <w:t>Participant: Gabriel Drozbik</w:t>
+      </w:r>
+    </w:p>
+    <w:p>
+      <w:pPr>
+        <w:pStyle w:val="BodyText"/>
+        <w:bidi w:val="0"/>
+        <w:spacing w:before="240" w:after="120"/>
+        <w:rPr>
+          <w:rFonts w:ascii="Liberation Sans" w:hAnsi="Liberation Sans"/>
+        </w:rPr>
+      </w:pPr>
+      <w:r>
+        <w:rPr>
+          <w:rFonts w:ascii="Liberation Sans" w:hAnsi="Liberation Sans"/>
+        </w:rPr>
+        <w:t>Candidate number: 8011</w:t>
       </w:r>
     </w:p>
     <w:p>
@@ -2061,7 +2077,9 @@
         </w:rPr>
       </w:pPr>
       <w:r>
-        <w:rPr/>
+        <w:rPr>
+          <w:rFonts w:ascii="Liberation Sans" w:hAnsi="Liberation Sans"/>
+        </w:rPr>
       </w:r>
     </w:p>
     <w:p>
@@ -2381,6 +2399,89 @@
           <w:szCs w:val="32"/>
         </w:rPr>
         <w:t>Technical solution:</w:t>
+      </w:r>
+    </w:p>
+    <w:p>
+      <w:pPr>
+        <w:pStyle w:val="BodyText"/>
+        <w:bidi w:val="0"/>
+        <w:spacing w:before="0" w:after="140"/>
+        <w:jc w:val="left"/>
+        <w:rPr>
+          <w:rFonts w:ascii="Liberation Sans" w:hAnsi="Liberation Sans"/>
+        </w:rPr>
+      </w:pPr>
+      <w:r>
+        <w:rPr>
+          <w:rFonts w:ascii="Liberation Sans" w:hAnsi="Liberation Sans"/>
+        </w:rPr>
+      </w:r>
+    </w:p>
+    <w:p>
+      <w:pPr>
+        <w:pStyle w:val="BodyText"/>
+        <w:bidi w:val="0"/>
+        <w:spacing w:before="0" w:after="140"/>
+        <w:jc w:val="left"/>
+        <w:rPr>
+          <w:rFonts w:ascii="Liberation Sans" w:hAnsi="Liberation Sans"/>
+        </w:rPr>
+      </w:pPr>
+      <w:r>
+        <w:rPr>
+          <w:rFonts w:ascii="Liberation Sans" w:hAnsi="Liberation Sans"/>
+        </w:rPr>
+      </w:r>
+    </w:p>
+    <w:p>
+      <w:pPr>
+        <w:pStyle w:val="BodyText"/>
+        <w:bidi w:val="0"/>
+        <w:spacing w:before="0" w:after="140"/>
+        <w:jc w:val="left"/>
+        <w:rPr>
+          <w:rFonts w:ascii="Liberation Sans" w:hAnsi="Liberation Sans"/>
+        </w:rPr>
+      </w:pPr>
+      <w:r>
+        <w:rPr>
+          <w:rFonts w:ascii="Liberation Sans" w:hAnsi="Liberation Sans"/>
+        </w:rPr>
+      </w:r>
+    </w:p>
+    <w:p>
+      <w:pPr>
+        <w:pStyle w:val="BodyText"/>
+        <w:bidi w:val="0"/>
+        <w:spacing w:before="0" w:after="140"/>
+        <w:jc w:val="left"/>
+        <w:rPr>
+          <w:rFonts w:ascii="Liberation Sans" w:hAnsi="Liberation Sans"/>
+          <w:b/>
+          <w:bCs/>
+          <w:sz w:val="32"/>
+          <w:szCs w:val="32"/>
+        </w:rPr>
+      </w:pPr>
+      <w:r>
+        <w:rPr>
+          <w:rFonts w:ascii="Liberation Sans" w:hAnsi="Liberation Sans"/>
+          <w:b/>
+          <w:bCs/>
+          <w:sz w:val="32"/>
+          <w:szCs w:val="32"/>
+        </w:rPr>
+        <w:t>Appendix</w:t>
+      </w:r>
+      <w:r>
+        <w:rPr>
+          <w:rFonts w:ascii="Liberation Sans" w:hAnsi="Liberation Sans"/>
+          <w:b/>
+          <w:bCs/>
+          <w:sz w:val="32"/>
+          <w:szCs w:val="32"/>
+        </w:rPr>
+        <w:t>:</w:t>
       </w:r>
     </w:p>
     <w:p>
@@ -60582,7 +60683,7 @@
     </w:r>
     <w:r>
       <w:rPr/>
-      <w:t>3</w:t>
+      <w:t>1</w:t>
     </w:r>
     <w:r>
       <w:rPr/>
@@ -60613,7 +60714,7 @@
     </w:r>
     <w:r>
       <w:rPr/>
-      <w:t>3</w:t>
+      <w:t>1</w:t>
     </w:r>
     <w:r>
       <w:rPr/>

</xml_diff>